<commit_message>
Additions to Part 2 of assignment 2.
Signed-off-by: uofl-sbabb <sbabb131@gmail.com>
</commit_message>
<xml_diff>
--- a/Project2/Assignment2-02.docx
+++ b/Project2/Assignment2-02.docx
@@ -172,6 +172,18 @@
     <w:p>
       <w:pPr>
         <w:pStyle w:val="ListNumber"/>
+        <w:numPr>
+          <w:ilvl w:val="0"/>
+          <w:numId w:val="10"/>
+        </w:numPr>
+      </w:pPr>
+      <w:r>
+        <w:t>Time series for each observation/measurement.</w:t>
+      </w:r>
+    </w:p>
+    <w:p>
+      <w:pPr>
+        <w:pStyle w:val="ListNumber"/>
       </w:pPr>
       <w:r>
         <w:t>What will break time-series analysis if not fixed? (timestamps, sorting, duplicates, types)</w:t>
@@ -180,6 +192,39 @@
     <w:p>
       <w:pPr>
         <w:pStyle w:val="ListNumber"/>
+        <w:numPr>
+          <w:ilvl w:val="0"/>
+          <w:numId w:val="10"/>
+        </w:numPr>
+      </w:pPr>
+      <w:r>
+        <w:t xml:space="preserve">Rows being out of order can </w:t>
+      </w:r>
+      <w:r>
+        <w:t>affect</w:t>
+      </w:r>
+      <w:r>
+        <w:t xml:space="preserve"> the graph. </w:t>
+      </w:r>
+      <w:r>
+        <w:t>Duplicate data</w:t>
+      </w:r>
+      <w:r>
+        <w:t xml:space="preserve"> can </w:t>
+      </w:r>
+      <w:r>
+        <w:t>affect</w:t>
+      </w:r>
+      <w:r>
+        <w:t xml:space="preserve"> </w:t>
+      </w:r>
+      <w:r>
+        <w:t xml:space="preserve">data with unique identifiers. Timestamps need to be trimmed/fix spacing, so it can be seen displayed cleanly on the graph. Missing values/outliers need to be handled this can affect the accuracy of the graph. </w:t>
+      </w:r>
+    </w:p>
+    <w:p>
+      <w:pPr>
+        <w:pStyle w:val="ListNumber"/>
       </w:pPr>
       <w:r>
         <w:t>What will mislead visualizations if not fixed? (missing, outliers, inconsistent sampling)</w:t>
@@ -188,6 +233,19 @@
     <w:p>
       <w:pPr>
         <w:pStyle w:val="ListNumber"/>
+        <w:numPr>
+          <w:ilvl w:val="0"/>
+          <w:numId w:val="10"/>
+        </w:numPr>
+      </w:pPr>
+      <w:r>
+        <w:lastRenderedPageBreak/>
+        <w:t xml:space="preserve">Missing values/outliers can affect the accuracy of the graph. Data being out of order can affect the overall visual analysis. </w:t>
+      </w:r>
+    </w:p>
+    <w:p>
+      <w:pPr>
+        <w:pStyle w:val="ListNumber"/>
       </w:pPr>
       <w:r>
         <w:t>What is your cleaning plan (step-by-step)?</w:t>
@@ -195,10 +253,87 @@
     </w:p>
     <w:p>
       <w:pPr>
+        <w:pStyle w:val="ListNumber"/>
+        <w:numPr>
+          <w:ilvl w:val="0"/>
+          <w:numId w:val="10"/>
+        </w:numPr>
+      </w:pPr>
+      <w:r>
+        <w:t>Fix the inconsistencies with ‘timestamp’ (slashes or dashes). Solution: convert ‘timestamp’ object type to datetime type</w:t>
+      </w:r>
+    </w:p>
+    <w:p>
+      <w:pPr>
+        <w:pStyle w:val="ListNumber"/>
+        <w:numPr>
+          <w:ilvl w:val="0"/>
+          <w:numId w:val="10"/>
+        </w:numPr>
+      </w:pPr>
+      <w:r>
+        <w:t>Fix the missing values with ‘timestamp’ and ‘</w:t>
+      </w:r>
+      <w:proofErr w:type="spellStart"/>
+      <w:r>
+        <w:t>metric_value</w:t>
+      </w:r>
+      <w:proofErr w:type="spellEnd"/>
+      <w:r>
+        <w:t>’. Solution: remove missing values for ‘timestamp’ and replace missing values with avg. for ‘</w:t>
+      </w:r>
+      <w:proofErr w:type="spellStart"/>
+      <w:r>
+        <w:t>metric_value</w:t>
+      </w:r>
+      <w:proofErr w:type="spellEnd"/>
+      <w:r>
+        <w:t>’.</w:t>
+      </w:r>
+    </w:p>
+    <w:p>
+      <w:pPr>
+        <w:pStyle w:val="ListNumber"/>
+        <w:numPr>
+          <w:ilvl w:val="0"/>
+          <w:numId w:val="10"/>
+        </w:numPr>
+      </w:pPr>
+      <w:r>
+        <w:t>Fix outlier with ‘</w:t>
+      </w:r>
+      <w:proofErr w:type="spellStart"/>
+      <w:r>
+        <w:t>metric_value</w:t>
+      </w:r>
+      <w:proofErr w:type="spellEnd"/>
+      <w:r>
+        <w:t>’ being the min. in the negatives. Solution: replace negative value with 0.</w:t>
+      </w:r>
+    </w:p>
+    <w:p>
+      <w:pPr>
+        <w:pStyle w:val="ListNumber"/>
+        <w:numPr>
+          <w:ilvl w:val="0"/>
+          <w:numId w:val="10"/>
+        </w:numPr>
+      </w:pPr>
+    </w:p>
+    <w:p>
+      <w:pPr>
         <w:pStyle w:val="Heading3"/>
       </w:pPr>
       <w:r>
-        <w:t>Q2 (15 pts) — Timestamp Cleaning (Pipeline: TRANSFORM)</w:t>
+        <w:t xml:space="preserve">Q2 (15 </w:t>
+      </w:r>
+      <w:proofErr w:type="gramStart"/>
+      <w:r>
+        <w:t>pts) —</w:t>
+      </w:r>
+      <w:proofErr w:type="gramEnd"/>
+      <w:r>
+        <w:t xml:space="preserve"> Timestamp Cleaning (Pipeline: TRANSFORM)</w:t>
       </w:r>
     </w:p>
     <w:p>
@@ -219,7 +354,6 @@
         <w:pStyle w:val="ListBullet"/>
       </w:pPr>
       <w:r>
-        <w:lastRenderedPageBreak/>
         <w:t>Drop rows with missing or invalid timestamps</w:t>
       </w:r>
     </w:p>
@@ -238,10 +372,361 @@
     </w:p>
     <w:p>
       <w:pPr>
+        <w:pStyle w:val="ListParagraph"/>
+        <w:numPr>
+          <w:ilvl w:val="0"/>
+          <w:numId w:val="10"/>
+        </w:numPr>
+      </w:pPr>
+      <w:r>
+        <w:t>Dropped missing value for ‘timestamp’ index 46:</w:t>
+      </w:r>
+    </w:p>
+    <w:p>
+      <w:pPr>
+        <w:pStyle w:val="ListParagraph"/>
+      </w:pPr>
+      <w:r>
+        <w:drawing>
+          <wp:inline distT="0" distB="0" distL="0" distR="0" wp14:anchorId="6B6C7562" wp14:editId="40D641F3">
+            <wp:extent cx="5486400" cy="970280"/>
+            <wp:effectExtent l="0" t="0" r="0" b="1270"/>
+            <wp:docPr id="1329575193" name="Picture 1"/>
+            <wp:cNvGraphicFramePr>
+              <a:graphicFrameLocks xmlns:a="http://schemas.openxmlformats.org/drawingml/2006/main" noChangeAspect="1"/>
+            </wp:cNvGraphicFramePr>
+            <a:graphic xmlns:a="http://schemas.openxmlformats.org/drawingml/2006/main">
+              <a:graphicData uri="http://schemas.openxmlformats.org/drawingml/2006/picture">
+                <pic:pic xmlns:pic="http://schemas.openxmlformats.org/drawingml/2006/picture">
+                  <pic:nvPicPr>
+                    <pic:cNvPr id="1329575193" name=""/>
+                    <pic:cNvPicPr/>
+                  </pic:nvPicPr>
+                  <pic:blipFill>
+                    <a:blip r:embed="rId8"/>
+                    <a:stretch>
+                      <a:fillRect/>
+                    </a:stretch>
+                  </pic:blipFill>
+                  <pic:spPr>
+                    <a:xfrm>
+                      <a:off x="0" y="0"/>
+                      <a:ext cx="5486400" cy="970280"/>
+                    </a:xfrm>
+                    <a:prstGeom prst="rect">
+                      <a:avLst/>
+                    </a:prstGeom>
+                  </pic:spPr>
+                </pic:pic>
+              </a:graphicData>
+            </a:graphic>
+          </wp:inline>
+        </w:drawing>
+      </w:r>
+    </w:p>
+    <w:p>
+      <w:pPr>
+        <w:pStyle w:val="ListParagraph"/>
+        <w:numPr>
+          <w:ilvl w:val="0"/>
+          <w:numId w:val="10"/>
+        </w:numPr>
+      </w:pPr>
+      <w:r>
+        <w:t xml:space="preserve">Dropped the row with </w:t>
+      </w:r>
+      <w:proofErr w:type="spellStart"/>
+      <w:r>
+        <w:t>na</w:t>
+      </w:r>
+      <w:proofErr w:type="spellEnd"/>
+      <w:r>
+        <w:t xml:space="preserve"> value from ‘</w:t>
+      </w:r>
+      <w:proofErr w:type="spellStart"/>
+      <w:r>
+        <w:t>tiimestamp</w:t>
+      </w:r>
+      <w:proofErr w:type="spellEnd"/>
+      <w:r>
+        <w:t>’:</w:t>
+      </w:r>
+    </w:p>
+    <w:p>
+      <w:pPr>
+        <w:pStyle w:val="ListParagraph"/>
+      </w:pPr>
+      <w:r>
+        <w:drawing>
+          <wp:inline distT="0" distB="0" distL="0" distR="0" wp14:anchorId="2B88BB6F" wp14:editId="09D14B09">
+            <wp:extent cx="5486400" cy="2571115"/>
+            <wp:effectExtent l="0" t="0" r="0" b="635"/>
+            <wp:docPr id="935333039" name="Picture 1"/>
+            <wp:cNvGraphicFramePr>
+              <a:graphicFrameLocks xmlns:a="http://schemas.openxmlformats.org/drawingml/2006/main" noChangeAspect="1"/>
+            </wp:cNvGraphicFramePr>
+            <a:graphic xmlns:a="http://schemas.openxmlformats.org/drawingml/2006/main">
+              <a:graphicData uri="http://schemas.openxmlformats.org/drawingml/2006/picture">
+                <pic:pic xmlns:pic="http://schemas.openxmlformats.org/drawingml/2006/picture">
+                  <pic:nvPicPr>
+                    <pic:cNvPr id="935333039" name=""/>
+                    <pic:cNvPicPr/>
+                  </pic:nvPicPr>
+                  <pic:blipFill>
+                    <a:blip r:embed="rId9"/>
+                    <a:stretch>
+                      <a:fillRect/>
+                    </a:stretch>
+                  </pic:blipFill>
+                  <pic:spPr>
+                    <a:xfrm>
+                      <a:off x="0" y="0"/>
+                      <a:ext cx="5486400" cy="2571115"/>
+                    </a:xfrm>
+                    <a:prstGeom prst="rect">
+                      <a:avLst/>
+                    </a:prstGeom>
+                  </pic:spPr>
+                </pic:pic>
+              </a:graphicData>
+            </a:graphic>
+          </wp:inline>
+        </w:drawing>
+      </w:r>
+    </w:p>
+    <w:p>
+      <w:pPr>
+        <w:pStyle w:val="ListParagraph"/>
+        <w:numPr>
+          <w:ilvl w:val="0"/>
+          <w:numId w:val="10"/>
+        </w:numPr>
+      </w:pPr>
+      <w:r>
+        <w:t>Change the ‘timestamp’ object type to datetime:</w:t>
+      </w:r>
+    </w:p>
+    <w:p>
+      <w:pPr>
+        <w:pStyle w:val="ListParagraph"/>
+      </w:pPr>
+      <w:r>
+        <w:lastRenderedPageBreak/>
+        <w:drawing>
+          <wp:inline distT="0" distB="0" distL="0" distR="0" wp14:anchorId="04F0A8BA" wp14:editId="52AA6C96">
+            <wp:extent cx="5486400" cy="1739265"/>
+            <wp:effectExtent l="0" t="0" r="0" b="0"/>
+            <wp:docPr id="2034794514" name="Picture 1"/>
+            <wp:cNvGraphicFramePr>
+              <a:graphicFrameLocks xmlns:a="http://schemas.openxmlformats.org/drawingml/2006/main" noChangeAspect="1"/>
+            </wp:cNvGraphicFramePr>
+            <a:graphic xmlns:a="http://schemas.openxmlformats.org/drawingml/2006/main">
+              <a:graphicData uri="http://schemas.openxmlformats.org/drawingml/2006/picture">
+                <pic:pic xmlns:pic="http://schemas.openxmlformats.org/drawingml/2006/picture">
+                  <pic:nvPicPr>
+                    <pic:cNvPr id="2034794514" name=""/>
+                    <pic:cNvPicPr/>
+                  </pic:nvPicPr>
+                  <pic:blipFill>
+                    <a:blip r:embed="rId10"/>
+                    <a:stretch>
+                      <a:fillRect/>
+                    </a:stretch>
+                  </pic:blipFill>
+                  <pic:spPr>
+                    <a:xfrm>
+                      <a:off x="0" y="0"/>
+                      <a:ext cx="5486400" cy="1739265"/>
+                    </a:xfrm>
+                    <a:prstGeom prst="rect">
+                      <a:avLst/>
+                    </a:prstGeom>
+                  </pic:spPr>
+                </pic:pic>
+              </a:graphicData>
+            </a:graphic>
+          </wp:inline>
+        </w:drawing>
+      </w:r>
+    </w:p>
+    <w:p>
+      <w:pPr>
+        <w:pStyle w:val="ListParagraph"/>
+      </w:pPr>
+      <w:r>
+        <w:drawing>
+          <wp:inline distT="0" distB="0" distL="0" distR="0" wp14:anchorId="1A575DEE" wp14:editId="6795419F">
+            <wp:extent cx="5486400" cy="3042285"/>
+            <wp:effectExtent l="0" t="0" r="0" b="5715"/>
+            <wp:docPr id="637837023" name="Picture 1"/>
+            <wp:cNvGraphicFramePr>
+              <a:graphicFrameLocks xmlns:a="http://schemas.openxmlformats.org/drawingml/2006/main" noChangeAspect="1"/>
+            </wp:cNvGraphicFramePr>
+            <a:graphic xmlns:a="http://schemas.openxmlformats.org/drawingml/2006/main">
+              <a:graphicData uri="http://schemas.openxmlformats.org/drawingml/2006/picture">
+                <pic:pic xmlns:pic="http://schemas.openxmlformats.org/drawingml/2006/picture">
+                  <pic:nvPicPr>
+                    <pic:cNvPr id="637837023" name=""/>
+                    <pic:cNvPicPr/>
+                  </pic:nvPicPr>
+                  <pic:blipFill>
+                    <a:blip r:embed="rId11"/>
+                    <a:stretch>
+                      <a:fillRect/>
+                    </a:stretch>
+                  </pic:blipFill>
+                  <pic:spPr>
+                    <a:xfrm>
+                      <a:off x="0" y="0"/>
+                      <a:ext cx="5486400" cy="3042285"/>
+                    </a:xfrm>
+                    <a:prstGeom prst="rect">
+                      <a:avLst/>
+                    </a:prstGeom>
+                  </pic:spPr>
+                </pic:pic>
+              </a:graphicData>
+            </a:graphic>
+          </wp:inline>
+        </w:drawing>
+      </w:r>
+    </w:p>
+    <w:p>
+      <w:pPr>
+        <w:pStyle w:val="ListParagraph"/>
+        <w:numPr>
+          <w:ilvl w:val="0"/>
+          <w:numId w:val="10"/>
+        </w:numPr>
+      </w:pPr>
+      <w:r>
+        <w:t>Replace missing ‘</w:t>
+      </w:r>
+      <w:proofErr w:type="spellStart"/>
+      <w:r>
+        <w:t>metric_value</w:t>
+      </w:r>
+      <w:proofErr w:type="spellEnd"/>
+      <w:r>
+        <w:t>’ with avg. value:</w:t>
+      </w:r>
+    </w:p>
+    <w:p>
+      <w:pPr>
+        <w:pStyle w:val="ListParagraph"/>
+      </w:pPr>
+      <w:r>
+        <w:drawing>
+          <wp:inline distT="0" distB="0" distL="0" distR="0" wp14:anchorId="39DD2466" wp14:editId="4A50D220">
+            <wp:extent cx="5486400" cy="2407920"/>
+            <wp:effectExtent l="0" t="0" r="0" b="0"/>
+            <wp:docPr id="2084334115" name="Picture 1"/>
+            <wp:cNvGraphicFramePr>
+              <a:graphicFrameLocks xmlns:a="http://schemas.openxmlformats.org/drawingml/2006/main" noChangeAspect="1"/>
+            </wp:cNvGraphicFramePr>
+            <a:graphic xmlns:a="http://schemas.openxmlformats.org/drawingml/2006/main">
+              <a:graphicData uri="http://schemas.openxmlformats.org/drawingml/2006/picture">
+                <pic:pic xmlns:pic="http://schemas.openxmlformats.org/drawingml/2006/picture">
+                  <pic:nvPicPr>
+                    <pic:cNvPr id="2084334115" name=""/>
+                    <pic:cNvPicPr/>
+                  </pic:nvPicPr>
+                  <pic:blipFill>
+                    <a:blip r:embed="rId12"/>
+                    <a:stretch>
+                      <a:fillRect/>
+                    </a:stretch>
+                  </pic:blipFill>
+                  <pic:spPr>
+                    <a:xfrm>
+                      <a:off x="0" y="0"/>
+                      <a:ext cx="5486400" cy="2407920"/>
+                    </a:xfrm>
+                    <a:prstGeom prst="rect">
+                      <a:avLst/>
+                    </a:prstGeom>
+                  </pic:spPr>
+                </pic:pic>
+              </a:graphicData>
+            </a:graphic>
+          </wp:inline>
+        </w:drawing>
+      </w:r>
+    </w:p>
+    <w:p>
+      <w:pPr>
+        <w:pStyle w:val="ListParagraph"/>
+        <w:numPr>
+          <w:ilvl w:val="0"/>
+          <w:numId w:val="10"/>
+        </w:numPr>
+      </w:pPr>
+      <w:r>
+        <w:t>Sort data by time:</w:t>
+      </w:r>
+    </w:p>
+    <w:p>
+      <w:pPr>
+        <w:pStyle w:val="ListParagraph"/>
+      </w:pPr>
+      <w:r>
+        <w:lastRenderedPageBreak/>
+        <w:drawing>
+          <wp:inline distT="0" distB="0" distL="0" distR="0" wp14:anchorId="652434B7" wp14:editId="295D8488">
+            <wp:extent cx="5486400" cy="2265680"/>
+            <wp:effectExtent l="0" t="0" r="0" b="1270"/>
+            <wp:docPr id="532187128" name="Picture 1"/>
+            <wp:cNvGraphicFramePr>
+              <a:graphicFrameLocks xmlns:a="http://schemas.openxmlformats.org/drawingml/2006/main" noChangeAspect="1"/>
+            </wp:cNvGraphicFramePr>
+            <a:graphic xmlns:a="http://schemas.openxmlformats.org/drawingml/2006/main">
+              <a:graphicData uri="http://schemas.openxmlformats.org/drawingml/2006/picture">
+                <pic:pic xmlns:pic="http://schemas.openxmlformats.org/drawingml/2006/picture">
+                  <pic:nvPicPr>
+                    <pic:cNvPr id="532187128" name=""/>
+                    <pic:cNvPicPr/>
+                  </pic:nvPicPr>
+                  <pic:blipFill>
+                    <a:blip r:embed="rId13"/>
+                    <a:stretch>
+                      <a:fillRect/>
+                    </a:stretch>
+                  </pic:blipFill>
+                  <pic:spPr>
+                    <a:xfrm>
+                      <a:off x="0" y="0"/>
+                      <a:ext cx="5486400" cy="2265680"/>
+                    </a:xfrm>
+                    <a:prstGeom prst="rect">
+                      <a:avLst/>
+                    </a:prstGeom>
+                  </pic:spPr>
+                </pic:pic>
+              </a:graphicData>
+            </a:graphic>
+          </wp:inline>
+        </w:drawing>
+      </w:r>
+    </w:p>
+    <w:p>
+      <w:pPr>
+        <w:pStyle w:val="ListParagraph"/>
+      </w:pPr>
+    </w:p>
+    <w:p>
+      <w:pPr>
         <w:pStyle w:val="Heading3"/>
       </w:pPr>
       <w:r>
-        <w:t>Q3 (5 pts) — Missing Values Strategy (Pipeline: TRANSFORM)</w:t>
+        <w:t xml:space="preserve">Q3 (5 </w:t>
+      </w:r>
+      <w:proofErr w:type="gramStart"/>
+      <w:r>
+        <w:t>pts) —</w:t>
+      </w:r>
+      <w:proofErr w:type="gramEnd"/>
+      <w:r>
+        <w:t xml:space="preserve"> Missing Values Strategy (Pipeline: TRANSFORM)</w:t>
       </w:r>
     </w:p>
     <w:p>
@@ -288,10 +773,38 @@
     </w:p>
     <w:p>
       <w:pPr>
+        <w:pStyle w:val="ListParagraph"/>
+        <w:numPr>
+          <w:ilvl w:val="0"/>
+          <w:numId w:val="10"/>
+        </w:numPr>
+      </w:pPr>
+      <w:r>
+        <w:t>I chose to fill ‘</w:t>
+      </w:r>
+      <w:proofErr w:type="spellStart"/>
+      <w:r>
+        <w:t>metric_value</w:t>
+      </w:r>
+      <w:proofErr w:type="spellEnd"/>
+      <w:r>
+        <w:t>’ with avg. metric value instead of dropping or forward/backward fill. Bias this method could introduce is having more average values being expressed in the dataset/data visualization process.</w:t>
+      </w:r>
+    </w:p>
+    <w:p>
+      <w:pPr>
         <w:pStyle w:val="Heading3"/>
       </w:pPr>
       <w:r>
-        <w:t>Q4 (5 pts) — Outliers Strategy (Pipeline: TRANSFORM)</w:t>
+        <w:t xml:space="preserve">Q4 (5 </w:t>
+      </w:r>
+      <w:proofErr w:type="gramStart"/>
+      <w:r>
+        <w:t>pts) —</w:t>
+      </w:r>
+      <w:proofErr w:type="gramEnd"/>
+      <w:r>
+        <w:t xml:space="preserve"> Outliers Strategy (Pipeline: TRANSFORM)</w:t>
       </w:r>
     </w:p>
     <w:p>
@@ -328,6 +841,7 @@
         <w:t>Write: How many outliers were flagged, and why is your decision reasonable?</w:t>
       </w:r>
     </w:p>
+    <w:p/>
     <w:p>
       <w:pPr>
         <w:pStyle w:val="Heading3"/>
@@ -378,6 +892,7 @@
         <w:pStyle w:val="ListNumber"/>
       </w:pPr>
       <w:r>
+        <w:lastRenderedPageBreak/>
         <w:t>Distribution view across time buckets (box/violin)</w:t>
       </w:r>
     </w:p>
@@ -457,17 +972,16 @@
         <w:pStyle w:val="ListBullet"/>
       </w:pPr>
       <w:r>
-        <w:lastRenderedPageBreak/>
         <w:t>What risk or uncertainty remains?</w:t>
       </w:r>
     </w:p>
     <w:sectPr>
-      <w:headerReference w:type="even" r:id="rId8"/>
-      <w:headerReference w:type="default" r:id="rId9"/>
-      <w:footerReference w:type="even" r:id="rId10"/>
-      <w:footerReference w:type="default" r:id="rId11"/>
-      <w:headerReference w:type="first" r:id="rId12"/>
-      <w:footerReference w:type="first" r:id="rId13"/>
+      <w:headerReference w:type="even" r:id="rId14"/>
+      <w:headerReference w:type="default" r:id="rId15"/>
+      <w:footerReference w:type="even" r:id="rId16"/>
+      <w:footerReference w:type="default" r:id="rId17"/>
+      <w:headerReference w:type="first" r:id="rId18"/>
+      <w:footerReference w:type="first" r:id="rId19"/>
       <w:pgSz w:w="12240" w:h="15840"/>
       <w:pgMar w:top="1440" w:right="1800" w:bottom="1440" w:left="1800" w:header="720" w:footer="720" w:gutter="0"/>
       <w:cols w:space="720"/>
@@ -775,6 +1289,118 @@
       </w:pPr>
       <w:rPr>
         <w:rFonts w:ascii="Symbol" w:hAnsi="Symbol" w:hint="default"/>
+      </w:rPr>
+    </w:lvl>
+  </w:abstractNum>
+  <w:abstractNum w:abstractNumId="9" w15:restartNumberingAfterBreak="0">
+    <w:nsid w:val="2D1D662A"/>
+    <w:multiLevelType w:val="hybridMultilevel"/>
+    <w:tmpl w:val="5CB03D4C"/>
+    <w:lvl w:ilvl="0" w:tplc="B024F624">
+      <w:numFmt w:val="bullet"/>
+      <w:lvlText w:val="-"/>
+      <w:lvlJc w:val="left"/>
+      <w:pPr>
+        <w:ind w:left="720" w:hanging="360"/>
+      </w:pPr>
+      <w:rPr>
+        <w:rFonts w:ascii="Cambria" w:eastAsiaTheme="minorEastAsia" w:hAnsi="Cambria" w:cstheme="minorBidi" w:hint="default"/>
+      </w:rPr>
+    </w:lvl>
+    <w:lvl w:ilvl="1" w:tplc="04090003" w:tentative="1">
+      <w:start w:val="1"/>
+      <w:numFmt w:val="bullet"/>
+      <w:lvlText w:val="o"/>
+      <w:lvlJc w:val="left"/>
+      <w:pPr>
+        <w:ind w:left="1440" w:hanging="360"/>
+      </w:pPr>
+      <w:rPr>
+        <w:rFonts w:ascii="Courier New" w:hAnsi="Courier New" w:cs="Courier New" w:hint="default"/>
+      </w:rPr>
+    </w:lvl>
+    <w:lvl w:ilvl="2" w:tplc="04090005" w:tentative="1">
+      <w:start w:val="1"/>
+      <w:numFmt w:val="bullet"/>
+      <w:lvlText w:val=""/>
+      <w:lvlJc w:val="left"/>
+      <w:pPr>
+        <w:ind w:left="2160" w:hanging="360"/>
+      </w:pPr>
+      <w:rPr>
+        <w:rFonts w:ascii="Wingdings" w:hAnsi="Wingdings" w:hint="default"/>
+      </w:rPr>
+    </w:lvl>
+    <w:lvl w:ilvl="3" w:tplc="04090001" w:tentative="1">
+      <w:start w:val="1"/>
+      <w:numFmt w:val="bullet"/>
+      <w:lvlText w:val=""/>
+      <w:lvlJc w:val="left"/>
+      <w:pPr>
+        <w:ind w:left="2880" w:hanging="360"/>
+      </w:pPr>
+      <w:rPr>
+        <w:rFonts w:ascii="Symbol" w:hAnsi="Symbol" w:hint="default"/>
+      </w:rPr>
+    </w:lvl>
+    <w:lvl w:ilvl="4" w:tplc="04090003" w:tentative="1">
+      <w:start w:val="1"/>
+      <w:numFmt w:val="bullet"/>
+      <w:lvlText w:val="o"/>
+      <w:lvlJc w:val="left"/>
+      <w:pPr>
+        <w:ind w:left="3600" w:hanging="360"/>
+      </w:pPr>
+      <w:rPr>
+        <w:rFonts w:ascii="Courier New" w:hAnsi="Courier New" w:cs="Courier New" w:hint="default"/>
+      </w:rPr>
+    </w:lvl>
+    <w:lvl w:ilvl="5" w:tplc="04090005" w:tentative="1">
+      <w:start w:val="1"/>
+      <w:numFmt w:val="bullet"/>
+      <w:lvlText w:val=""/>
+      <w:lvlJc w:val="left"/>
+      <w:pPr>
+        <w:ind w:left="4320" w:hanging="360"/>
+      </w:pPr>
+      <w:rPr>
+        <w:rFonts w:ascii="Wingdings" w:hAnsi="Wingdings" w:hint="default"/>
+      </w:rPr>
+    </w:lvl>
+    <w:lvl w:ilvl="6" w:tplc="04090001" w:tentative="1">
+      <w:start w:val="1"/>
+      <w:numFmt w:val="bullet"/>
+      <w:lvlText w:val=""/>
+      <w:lvlJc w:val="left"/>
+      <w:pPr>
+        <w:ind w:left="5040" w:hanging="360"/>
+      </w:pPr>
+      <w:rPr>
+        <w:rFonts w:ascii="Symbol" w:hAnsi="Symbol" w:hint="default"/>
+      </w:rPr>
+    </w:lvl>
+    <w:lvl w:ilvl="7" w:tplc="04090003" w:tentative="1">
+      <w:start w:val="1"/>
+      <w:numFmt w:val="bullet"/>
+      <w:lvlText w:val="o"/>
+      <w:lvlJc w:val="left"/>
+      <w:pPr>
+        <w:ind w:left="5760" w:hanging="360"/>
+      </w:pPr>
+      <w:rPr>
+        <w:rFonts w:ascii="Courier New" w:hAnsi="Courier New" w:cs="Courier New" w:hint="default"/>
+      </w:rPr>
+    </w:lvl>
+    <w:lvl w:ilvl="8" w:tplc="04090005" w:tentative="1">
+      <w:start w:val="1"/>
+      <w:numFmt w:val="bullet"/>
+      <w:lvlText w:val=""/>
+      <w:lvlJc w:val="left"/>
+      <w:pPr>
+        <w:ind w:left="6480" w:hanging="360"/>
+      </w:pPr>
+      <w:rPr>
+        <w:rFonts w:ascii="Wingdings" w:hAnsi="Wingdings" w:hint="default"/>
       </w:rPr>
     </w:lvl>
   </w:abstractNum>
@@ -804,6 +1430,9 @@
   </w:num>
   <w:num w:numId="9" w16cid:durableId="2006204755">
     <w:abstractNumId w:val="0"/>
+  </w:num>
+  <w:num w:numId="10" w16cid:durableId="641037451">
+    <w:abstractNumId w:val="9"/>
   </w:num>
 </w:numbering>
 </file>

</xml_diff>

<commit_message>
detected outliers using z-score.
Signed-off-by: uofl-sbabb <sbabb131@gmail.com>
</commit_message>
<xml_diff>
--- a/Project2/Assignment2-02.docx
+++ b/Project2/Assignment2-02.docx
@@ -387,6 +387,9 @@
         <w:pStyle w:val="ListParagraph"/>
       </w:pPr>
       <w:r>
+        <w:rPr>
+          <w:noProof/>
+        </w:rPr>
         <w:drawing>
           <wp:inline distT="0" distB="0" distL="0" distR="0" wp14:anchorId="6B6C7562" wp14:editId="40D641F3">
             <wp:extent cx="5486400" cy="970280"/>
@@ -457,6 +460,9 @@
         <w:pStyle w:val="ListParagraph"/>
       </w:pPr>
       <w:r>
+        <w:rPr>
+          <w:noProof/>
+        </w:rPr>
         <w:drawing>
           <wp:inline distT="0" distB="0" distL="0" distR="0" wp14:anchorId="2B88BB6F" wp14:editId="09D14B09">
             <wp:extent cx="5486400" cy="2571115"/>
@@ -511,6 +517,9 @@
         <w:pStyle w:val="ListParagraph"/>
       </w:pPr>
       <w:r>
+        <w:rPr>
+          <w:noProof/>
+        </w:rPr>
         <w:lastRenderedPageBreak/>
         <w:drawing>
           <wp:inline distT="0" distB="0" distL="0" distR="0" wp14:anchorId="04F0A8BA" wp14:editId="52AA6C96">
@@ -554,6 +563,9 @@
         <w:pStyle w:val="ListParagraph"/>
       </w:pPr>
       <w:r>
+        <w:rPr>
+          <w:noProof/>
+        </w:rPr>
         <w:drawing>
           <wp:inline distT="0" distB="0" distL="0" distR="0" wp14:anchorId="1A575DEE" wp14:editId="6795419F">
             <wp:extent cx="5486400" cy="3042285"/>
@@ -616,6 +628,9 @@
         <w:pStyle w:val="ListParagraph"/>
       </w:pPr>
       <w:r>
+        <w:rPr>
+          <w:noProof/>
+        </w:rPr>
         <w:drawing>
           <wp:inline distT="0" distB="0" distL="0" distR="0" wp14:anchorId="39DD2466" wp14:editId="4A50D220">
             <wp:extent cx="5486400" cy="2407920"/>
@@ -670,6 +685,9 @@
         <w:pStyle w:val="ListParagraph"/>
       </w:pPr>
       <w:r>
+        <w:rPr>
+          <w:noProof/>
+        </w:rPr>
         <w:lastRenderedPageBreak/>
         <w:drawing>
           <wp:inline distT="0" distB="0" distL="0" distR="0" wp14:anchorId="652434B7" wp14:editId="295D8488">
@@ -841,6 +859,124 @@
         <w:t>Write: How many outliers were flagged, and why is your decision reasonable?</w:t>
       </w:r>
     </w:p>
+    <w:p>
+      <w:pPr>
+        <w:pStyle w:val="ListParagraph"/>
+        <w:numPr>
+          <w:ilvl w:val="0"/>
+          <w:numId w:val="10"/>
+        </w:numPr>
+      </w:pPr>
+      <w:r>
+        <w:t xml:space="preserve">There were over 19 outliers flagged for the </w:t>
+      </w:r>
+      <w:proofErr w:type="spellStart"/>
+      <w:r>
+        <w:t>meters_value</w:t>
+      </w:r>
+      <w:proofErr w:type="spellEnd"/>
+      <w:r>
+        <w:t xml:space="preserve"> column. I decided to remove the outliers. This resulted in the </w:t>
+      </w:r>
+      <w:proofErr w:type="spellStart"/>
+      <w:r>
+        <w:t>zscore</w:t>
+      </w:r>
+      <w:proofErr w:type="spellEnd"/>
+      <w:r>
+        <w:t xml:space="preserve"> value being closer to the 0 range, meaning the average value is more expressed.</w:t>
+      </w:r>
+    </w:p>
+    <w:p>
+      <w:pPr>
+        <w:pStyle w:val="ListParagraph"/>
+      </w:pPr>
+      <w:r>
+        <w:lastRenderedPageBreak/>
+        <w:drawing>
+          <wp:inline distT="0" distB="0" distL="0" distR="0" wp14:anchorId="1579348E" wp14:editId="06E6E0AB">
+            <wp:extent cx="5486400" cy="1668145"/>
+            <wp:effectExtent l="0" t="0" r="0" b="8255"/>
+            <wp:docPr id="1822166004" name="Picture 1"/>
+            <wp:cNvGraphicFramePr>
+              <a:graphicFrameLocks xmlns:a="http://schemas.openxmlformats.org/drawingml/2006/main" noChangeAspect="1"/>
+            </wp:cNvGraphicFramePr>
+            <a:graphic xmlns:a="http://schemas.openxmlformats.org/drawingml/2006/main">
+              <a:graphicData uri="http://schemas.openxmlformats.org/drawingml/2006/picture">
+                <pic:pic xmlns:pic="http://schemas.openxmlformats.org/drawingml/2006/picture">
+                  <pic:nvPicPr>
+                    <pic:cNvPr id="1822166004" name=""/>
+                    <pic:cNvPicPr/>
+                  </pic:nvPicPr>
+                  <pic:blipFill>
+                    <a:blip r:embed="rId14"/>
+                    <a:stretch>
+                      <a:fillRect/>
+                    </a:stretch>
+                  </pic:blipFill>
+                  <pic:spPr>
+                    <a:xfrm>
+                      <a:off x="0" y="0"/>
+                      <a:ext cx="5486400" cy="1668145"/>
+                    </a:xfrm>
+                    <a:prstGeom prst="rect">
+                      <a:avLst/>
+                    </a:prstGeom>
+                  </pic:spPr>
+                </pic:pic>
+              </a:graphicData>
+            </a:graphic>
+          </wp:inline>
+        </w:drawing>
+      </w:r>
+    </w:p>
+    <w:p>
+      <w:pPr>
+        <w:pStyle w:val="ListParagraph"/>
+      </w:pPr>
+      <w:r>
+        <w:drawing>
+          <wp:inline distT="0" distB="0" distL="0" distR="0" wp14:anchorId="58F0AA82" wp14:editId="6AAA00BD">
+            <wp:extent cx="5486400" cy="3017520"/>
+            <wp:effectExtent l="0" t="0" r="0" b="0"/>
+            <wp:docPr id="836454462" name="Picture 1"/>
+            <wp:cNvGraphicFramePr>
+              <a:graphicFrameLocks xmlns:a="http://schemas.openxmlformats.org/drawingml/2006/main" noChangeAspect="1"/>
+            </wp:cNvGraphicFramePr>
+            <a:graphic xmlns:a="http://schemas.openxmlformats.org/drawingml/2006/main">
+              <a:graphicData uri="http://schemas.openxmlformats.org/drawingml/2006/picture">
+                <pic:pic xmlns:pic="http://schemas.openxmlformats.org/drawingml/2006/picture">
+                  <pic:nvPicPr>
+                    <pic:cNvPr id="836454462" name=""/>
+                    <pic:cNvPicPr/>
+                  </pic:nvPicPr>
+                  <pic:blipFill>
+                    <a:blip r:embed="rId15"/>
+                    <a:stretch>
+                      <a:fillRect/>
+                    </a:stretch>
+                  </pic:blipFill>
+                  <pic:spPr>
+                    <a:xfrm>
+                      <a:off x="0" y="0"/>
+                      <a:ext cx="5486400" cy="3017520"/>
+                    </a:xfrm>
+                    <a:prstGeom prst="rect">
+                      <a:avLst/>
+                    </a:prstGeom>
+                  </pic:spPr>
+                </pic:pic>
+              </a:graphicData>
+            </a:graphic>
+          </wp:inline>
+        </w:drawing>
+      </w:r>
+    </w:p>
+    <w:p>
+      <w:pPr>
+        <w:pStyle w:val="ListParagraph"/>
+      </w:pPr>
+    </w:p>
     <w:p/>
     <w:p>
       <w:pPr>
@@ -892,7 +1028,6 @@
         <w:pStyle w:val="ListNumber"/>
       </w:pPr>
       <w:r>
-        <w:lastRenderedPageBreak/>
         <w:t>Distribution view across time buckets (box/violin)</w:t>
       </w:r>
     </w:p>
@@ -901,6 +1036,7 @@
         <w:t>Write under each plot: what it reveals + one risk of misinterpretation.</w:t>
       </w:r>
     </w:p>
+    <w:p/>
     <w:p>
       <w:pPr>
         <w:pStyle w:val="Heading3"/>
@@ -919,6 +1055,7 @@
         <w:pStyle w:val="ListBullet"/>
       </w:pPr>
       <w:r>
+        <w:lastRenderedPageBreak/>
         <w:t>A message title (states conclusion)</w:t>
       </w:r>
     </w:p>
@@ -976,12 +1113,12 @@
       </w:r>
     </w:p>
     <w:sectPr>
-      <w:headerReference w:type="even" r:id="rId14"/>
-      <w:headerReference w:type="default" r:id="rId15"/>
-      <w:footerReference w:type="even" r:id="rId16"/>
-      <w:footerReference w:type="default" r:id="rId17"/>
-      <w:headerReference w:type="first" r:id="rId18"/>
-      <w:footerReference w:type="first" r:id="rId19"/>
+      <w:headerReference w:type="even" r:id="rId16"/>
+      <w:headerReference w:type="default" r:id="rId17"/>
+      <w:footerReference w:type="even" r:id="rId18"/>
+      <w:footerReference w:type="default" r:id="rId19"/>
+      <w:headerReference w:type="first" r:id="rId20"/>
+      <w:footerReference w:type="first" r:id="rId21"/>
       <w:pgSz w:w="12240" w:h="15840"/>
       <w:pgMar w:top="1440" w:right="1800" w:bottom="1440" w:left="1800" w:header="720" w:footer="720" w:gutter="0"/>
       <w:cols w:space="720"/>

</xml_diff>

<commit_message>
clean timeseries, trend of uncertainty
Signed-off-by: uofl-sbabb <sbabb131@gmail.com>
</commit_message>
<xml_diff>
--- a/Project2/Assignment2-02.docx
+++ b/Project2/Assignment2-02.docx
@@ -1014,6 +1014,9 @@
       <w:r>
         <w:t>Trend + uncertainty band</w:t>
       </w:r>
+      <w:r>
+        <w:t xml:space="preserve"> – bar plot with error bars</w:t>
+      </w:r>
     </w:p>
     <w:p>
       <w:pPr>
@@ -1036,13 +1039,140 @@
         <w:t>Write under each plot: what it reveals + one risk of misinterpretation.</w:t>
       </w:r>
     </w:p>
+    <w:p>
+      <w:r>
+        <w:lastRenderedPageBreak/>
+        <w:drawing>
+          <wp:inline distT="0" distB="0" distL="0" distR="0" wp14:anchorId="1248A03A" wp14:editId="25BCA99F">
+            <wp:extent cx="5486400" cy="2745105"/>
+            <wp:effectExtent l="0" t="0" r="0" b="0"/>
+            <wp:docPr id="1804783402" name="Picture 1"/>
+            <wp:cNvGraphicFramePr>
+              <a:graphicFrameLocks xmlns:a="http://schemas.openxmlformats.org/drawingml/2006/main" noChangeAspect="1"/>
+            </wp:cNvGraphicFramePr>
+            <a:graphic xmlns:a="http://schemas.openxmlformats.org/drawingml/2006/main">
+              <a:graphicData uri="http://schemas.openxmlformats.org/drawingml/2006/picture">
+                <pic:pic xmlns:pic="http://schemas.openxmlformats.org/drawingml/2006/picture">
+                  <pic:nvPicPr>
+                    <pic:cNvPr id="1804783402" name=""/>
+                    <pic:cNvPicPr/>
+                  </pic:nvPicPr>
+                  <pic:blipFill>
+                    <a:blip r:embed="rId16"/>
+                    <a:stretch>
+                      <a:fillRect/>
+                    </a:stretch>
+                  </pic:blipFill>
+                  <pic:spPr>
+                    <a:xfrm>
+                      <a:off x="0" y="0"/>
+                      <a:ext cx="5486400" cy="2745105"/>
+                    </a:xfrm>
+                    <a:prstGeom prst="rect">
+                      <a:avLst/>
+                    </a:prstGeom>
+                  </pic:spPr>
+                </pic:pic>
+              </a:graphicData>
+            </a:graphic>
+          </wp:inline>
+        </w:drawing>
+      </w:r>
+    </w:p>
+    <w:p>
+      <w:r>
+        <w:drawing>
+          <wp:inline distT="0" distB="0" distL="0" distR="0" wp14:anchorId="5B76A4A3" wp14:editId="27890AB1">
+            <wp:extent cx="5486400" cy="2049780"/>
+            <wp:effectExtent l="0" t="0" r="0" b="7620"/>
+            <wp:docPr id="989716739" name="Picture 1"/>
+            <wp:cNvGraphicFramePr>
+              <a:graphicFrameLocks xmlns:a="http://schemas.openxmlformats.org/drawingml/2006/main" noChangeAspect="1"/>
+            </wp:cNvGraphicFramePr>
+            <a:graphic xmlns:a="http://schemas.openxmlformats.org/drawingml/2006/main">
+              <a:graphicData uri="http://schemas.openxmlformats.org/drawingml/2006/picture">
+                <pic:pic xmlns:pic="http://schemas.openxmlformats.org/drawingml/2006/picture">
+                  <pic:nvPicPr>
+                    <pic:cNvPr id="989716739" name=""/>
+                    <pic:cNvPicPr/>
+                  </pic:nvPicPr>
+                  <pic:blipFill>
+                    <a:blip r:embed="rId17"/>
+                    <a:stretch>
+                      <a:fillRect/>
+                    </a:stretch>
+                  </pic:blipFill>
+                  <pic:spPr>
+                    <a:xfrm>
+                      <a:off x="0" y="0"/>
+                      <a:ext cx="5486400" cy="2049780"/>
+                    </a:xfrm>
+                    <a:prstGeom prst="rect">
+                      <a:avLst/>
+                    </a:prstGeom>
+                  </pic:spPr>
+                </pic:pic>
+              </a:graphicData>
+            </a:graphic>
+          </wp:inline>
+        </w:drawing>
+      </w:r>
+    </w:p>
+    <w:p>
+      <w:r>
+        <w:drawing>
+          <wp:inline distT="0" distB="0" distL="0" distR="0" wp14:anchorId="1AE5DF82" wp14:editId="42BA229B">
+            <wp:extent cx="5486400" cy="2376170"/>
+            <wp:effectExtent l="0" t="0" r="0" b="5080"/>
+            <wp:docPr id="1740886430" name="Picture 1"/>
+            <wp:cNvGraphicFramePr>
+              <a:graphicFrameLocks xmlns:a="http://schemas.openxmlformats.org/drawingml/2006/main" noChangeAspect="1"/>
+            </wp:cNvGraphicFramePr>
+            <a:graphic xmlns:a="http://schemas.openxmlformats.org/drawingml/2006/main">
+              <a:graphicData uri="http://schemas.openxmlformats.org/drawingml/2006/picture">
+                <pic:pic xmlns:pic="http://schemas.openxmlformats.org/drawingml/2006/picture">
+                  <pic:nvPicPr>
+                    <pic:cNvPr id="1740886430" name=""/>
+                    <pic:cNvPicPr/>
+                  </pic:nvPicPr>
+                  <pic:blipFill>
+                    <a:blip r:embed="rId18"/>
+                    <a:stretch>
+                      <a:fillRect/>
+                    </a:stretch>
+                  </pic:blipFill>
+                  <pic:spPr>
+                    <a:xfrm>
+                      <a:off x="0" y="0"/>
+                      <a:ext cx="5486400" cy="2376170"/>
+                    </a:xfrm>
+                    <a:prstGeom prst="rect">
+                      <a:avLst/>
+                    </a:prstGeom>
+                  </pic:spPr>
+                </pic:pic>
+              </a:graphicData>
+            </a:graphic>
+          </wp:inline>
+        </w:drawing>
+      </w:r>
+    </w:p>
     <w:p/>
     <w:p>
       <w:pPr>
         <w:pStyle w:val="Heading3"/>
       </w:pPr>
       <w:r>
-        <w:t>Q6 (10 pts) — Decision Ready Capstone (Pipeline: INTERPRETATION)</w:t>
+        <w:lastRenderedPageBreak/>
+        <w:t xml:space="preserve">Q6 (10 </w:t>
+      </w:r>
+      <w:proofErr w:type="gramStart"/>
+      <w:r>
+        <w:t>pts) —</w:t>
+      </w:r>
+      <w:proofErr w:type="gramEnd"/>
+      <w:r>
+        <w:t xml:space="preserve"> Decision Ready Capstone (Pipeline: INTERPRETATION)</w:t>
       </w:r>
     </w:p>
     <w:p>
@@ -1055,7 +1185,6 @@
         <w:pStyle w:val="ListBullet"/>
       </w:pPr>
       <w:r>
-        <w:lastRenderedPageBreak/>
         <w:t>A message title (states conclusion)</w:t>
       </w:r>
     </w:p>
@@ -1113,12 +1242,12 @@
       </w:r>
     </w:p>
     <w:sectPr>
-      <w:headerReference w:type="even" r:id="rId16"/>
-      <w:headerReference w:type="default" r:id="rId17"/>
-      <w:footerReference w:type="even" r:id="rId18"/>
-      <w:footerReference w:type="default" r:id="rId19"/>
-      <w:headerReference w:type="first" r:id="rId20"/>
-      <w:footerReference w:type="first" r:id="rId21"/>
+      <w:headerReference w:type="even" r:id="rId19"/>
+      <w:headerReference w:type="default" r:id="rId20"/>
+      <w:footerReference w:type="even" r:id="rId21"/>
+      <w:footerReference w:type="default" r:id="rId22"/>
+      <w:headerReference w:type="first" r:id="rId23"/>
+      <w:footerReference w:type="first" r:id="rId24"/>
       <w:pgSz w:w="12240" w:h="15840"/>
       <w:pgMar w:top="1440" w:right="1800" w:bottom="1440" w:left="1800" w:header="720" w:footer="720" w:gutter="0"/>
       <w:cols w:space="720"/>

</xml_diff>

<commit_message>
graph seasonal aggregate and distribution.
Signed-off-by: uofl-sbabb <sbabb131@gmail.com>
</commit_message>
<xml_diff>
--- a/Project2/Assignment2-02.docx
+++ b/Project2/Assignment2-02.docx
@@ -272,23 +272,7 @@
         </w:numPr>
       </w:pPr>
       <w:r>
-        <w:t>Fix the missing values with ‘timestamp’ and ‘</w:t>
-      </w:r>
-      <w:proofErr w:type="spellStart"/>
-      <w:r>
-        <w:t>metric_value</w:t>
-      </w:r>
-      <w:proofErr w:type="spellEnd"/>
-      <w:r>
-        <w:t>’. Solution: remove missing values for ‘timestamp’ and replace missing values with avg. for ‘</w:t>
-      </w:r>
-      <w:proofErr w:type="spellStart"/>
-      <w:r>
-        <w:t>metric_value</w:t>
-      </w:r>
-      <w:proofErr w:type="spellEnd"/>
-      <w:r>
-        <w:t>’.</w:t>
+        <w:t>Fix the missing values with ‘timestamp’ and ‘metric_value’. Solution: remove missing values for ‘timestamp’ and replace missing values with avg. for ‘metric_value’.</w:t>
       </w:r>
     </w:p>
     <w:p>
@@ -300,15 +284,7 @@
         </w:numPr>
       </w:pPr>
       <w:r>
-        <w:t>Fix outlier with ‘</w:t>
-      </w:r>
-      <w:proofErr w:type="spellStart"/>
-      <w:r>
-        <w:t>metric_value</w:t>
-      </w:r>
-      <w:proofErr w:type="spellEnd"/>
-      <w:r>
-        <w:t>’ being the min. in the negatives. Solution: replace negative value with 0.</w:t>
+        <w:t>Fix outlier with ‘metric_value’ being the min. in the negatives. Solution: replace negative value with 0.</w:t>
       </w:r>
     </w:p>
     <w:p>
@@ -325,15 +301,7 @@
         <w:pStyle w:val="Heading3"/>
       </w:pPr>
       <w:r>
-        <w:t xml:space="preserve">Q2 (15 </w:t>
-      </w:r>
-      <w:proofErr w:type="gramStart"/>
-      <w:r>
-        <w:t>pts) —</w:t>
-      </w:r>
-      <w:proofErr w:type="gramEnd"/>
-      <w:r>
-        <w:t xml:space="preserve"> Timestamp Cleaning (Pipeline: TRANSFORM)</w:t>
+        <w:t>Q2 (15 pts) — Timestamp Cleaning (Pipeline: TRANSFORM)</w:t>
       </w:r>
     </w:p>
     <w:p>
@@ -436,23 +404,7 @@
         </w:numPr>
       </w:pPr>
       <w:r>
-        <w:t xml:space="preserve">Dropped the row with </w:t>
-      </w:r>
-      <w:proofErr w:type="spellStart"/>
-      <w:r>
-        <w:t>na</w:t>
-      </w:r>
-      <w:proofErr w:type="spellEnd"/>
-      <w:r>
-        <w:t xml:space="preserve"> value from ‘</w:t>
-      </w:r>
-      <w:proofErr w:type="spellStart"/>
-      <w:r>
-        <w:t>tiimestamp</w:t>
-      </w:r>
-      <w:proofErr w:type="spellEnd"/>
-      <w:r>
-        <w:t>’:</w:t>
+        <w:t>Dropped the row with na value from ‘tiimestamp’:</w:t>
       </w:r>
     </w:p>
     <w:p>
@@ -612,15 +564,7 @@
         </w:numPr>
       </w:pPr>
       <w:r>
-        <w:t>Replace missing ‘</w:t>
-      </w:r>
-      <w:proofErr w:type="spellStart"/>
-      <w:r>
-        <w:t>metric_value</w:t>
-      </w:r>
-      <w:proofErr w:type="spellEnd"/>
-      <w:r>
-        <w:t>’ with avg. value:</w:t>
+        <w:t>Replace missing ‘metric_value’ with avg. value:</w:t>
       </w:r>
     </w:p>
     <w:p>
@@ -736,15 +680,7 @@
         <w:pStyle w:val="Heading3"/>
       </w:pPr>
       <w:r>
-        <w:t xml:space="preserve">Q3 (5 </w:t>
-      </w:r>
-      <w:proofErr w:type="gramStart"/>
-      <w:r>
-        <w:t>pts) —</w:t>
-      </w:r>
-      <w:proofErr w:type="gramEnd"/>
-      <w:r>
-        <w:t xml:space="preserve"> Missing Values Strategy (Pipeline: TRANSFORM)</w:t>
+        <w:t>Q3 (5 pts) — Missing Values Strategy (Pipeline: TRANSFORM)</w:t>
       </w:r>
     </w:p>
     <w:p>
@@ -798,15 +734,7 @@
         </w:numPr>
       </w:pPr>
       <w:r>
-        <w:t>I chose to fill ‘</w:t>
-      </w:r>
-      <w:proofErr w:type="spellStart"/>
-      <w:r>
-        <w:t>metric_value</w:t>
-      </w:r>
-      <w:proofErr w:type="spellEnd"/>
-      <w:r>
-        <w:t>’ with avg. metric value instead of dropping or forward/backward fill. Bias this method could introduce is having more average values being expressed in the dataset/data visualization process.</w:t>
+        <w:t>I chose to fill ‘metric_value’ with avg. metric value instead of dropping or forward/backward fill. Bias this method could introduce is having more average values being expressed in the dataset/data visualization process.</w:t>
       </w:r>
     </w:p>
     <w:p>
@@ -814,15 +742,7 @@
         <w:pStyle w:val="Heading3"/>
       </w:pPr>
       <w:r>
-        <w:t xml:space="preserve">Q4 (5 </w:t>
-      </w:r>
-      <w:proofErr w:type="gramStart"/>
-      <w:r>
-        <w:t>pts) —</w:t>
-      </w:r>
-      <w:proofErr w:type="gramEnd"/>
-      <w:r>
-        <w:t xml:space="preserve"> Outliers Strategy (Pipeline: TRANSFORM)</w:t>
+        <w:t>Q4 (5 pts) — Outliers Strategy (Pipeline: TRANSFORM)</w:t>
       </w:r>
     </w:p>
     <w:p>
@@ -868,23 +788,7 @@
         </w:numPr>
       </w:pPr>
       <w:r>
-        <w:t xml:space="preserve">There were over 19 outliers flagged for the </w:t>
-      </w:r>
-      <w:proofErr w:type="spellStart"/>
-      <w:r>
-        <w:t>meters_value</w:t>
-      </w:r>
-      <w:proofErr w:type="spellEnd"/>
-      <w:r>
-        <w:t xml:space="preserve"> column. I decided to remove the outliers. This resulted in the </w:t>
-      </w:r>
-      <w:proofErr w:type="spellStart"/>
-      <w:r>
-        <w:t>zscore</w:t>
-      </w:r>
-      <w:proofErr w:type="spellEnd"/>
-      <w:r>
-        <w:t xml:space="preserve"> value being closer to the 0 range, meaning the average value is more expressed.</w:t>
+        <w:t>There were over 19 outliers flagged for the meters_value column. I decided to remove the outliers. This resulted in the zscore value being closer to the 0 range, meaning the average value is more expressed.</w:t>
       </w:r>
     </w:p>
     <w:p>
@@ -892,6 +796,9 @@
         <w:pStyle w:val="ListParagraph"/>
       </w:pPr>
       <w:r>
+        <w:rPr>
+          <w:noProof/>
+        </w:rPr>
         <w:lastRenderedPageBreak/>
         <w:drawing>
           <wp:inline distT="0" distB="0" distL="0" distR="0" wp14:anchorId="1579348E" wp14:editId="06E6E0AB">
@@ -935,6 +842,9 @@
         <w:pStyle w:val="ListParagraph"/>
       </w:pPr>
       <w:r>
+        <w:rPr>
+          <w:noProof/>
+        </w:rPr>
         <w:drawing>
           <wp:inline distT="0" distB="0" distL="0" distR="0" wp14:anchorId="58F0AA82" wp14:editId="6AAA00BD">
             <wp:extent cx="5486400" cy="3017520"/>
@@ -1041,6 +951,9 @@
     </w:p>
     <w:p>
       <w:r>
+        <w:rPr>
+          <w:noProof/>
+        </w:rPr>
         <w:lastRenderedPageBreak/>
         <w:drawing>
           <wp:inline distT="0" distB="0" distL="0" distR="0" wp14:anchorId="1248A03A" wp14:editId="25BCA99F">
@@ -1080,7 +993,25 @@
       </w:r>
     </w:p>
     <w:p>
+      <w:pPr>
+        <w:pStyle w:val="ListParagraph"/>
+        <w:numPr>
+          <w:ilvl w:val="0"/>
+          <w:numId w:val="10"/>
+        </w:numPr>
+      </w:pPr>
       <w:r>
+        <w:t>Time series plot showing trend among the metric_value. You can see that the metric_value often increases and decreases. Yearly increases.</w:t>
+      </w:r>
+      <w:r>
+        <w:t xml:space="preserve"> A risk this graph shows is high volatility and uncertainty with the infrequencies with the metric_value.</w:t>
+      </w:r>
+    </w:p>
+    <w:p>
+      <w:r>
+        <w:rPr>
+          <w:noProof/>
+        </w:rPr>
         <w:drawing>
           <wp:inline distT="0" distB="0" distL="0" distR="0" wp14:anchorId="5B76A4A3" wp14:editId="27890AB1">
             <wp:extent cx="5486400" cy="2049780"/>
@@ -1119,7 +1050,26 @@
       </w:r>
     </w:p>
     <w:p>
+      <w:pPr>
+        <w:pStyle w:val="ListParagraph"/>
+        <w:numPr>
+          <w:ilvl w:val="0"/>
+          <w:numId w:val="10"/>
+        </w:numPr>
+      </w:pPr>
       <w:r>
+        <w:t>Two time series plots show the increase and decrease of the two numerical values. You can see that the metric value increases each year. A risk with this data plot is the upward movement could be mistaken for sustained long-term growth when it may partly reflect seasonality or external factors, not a structural increase. Another risk for the second plot, The random spikes could be misread as meaningful patterns or trends, when they may simply reflect noise or short-term fluctuations rather than systematic change.</w:t>
+      </w:r>
+      <w:r>
+        <w:t xml:space="preserve"> </w:t>
+      </w:r>
+    </w:p>
+    <w:p>
+      <w:r>
+        <w:rPr>
+          <w:noProof/>
+        </w:rPr>
+        <w:lastRenderedPageBreak/>
         <w:drawing>
           <wp:inline distT="0" distB="0" distL="0" distR="0" wp14:anchorId="1AE5DF82" wp14:editId="42BA229B">
             <wp:extent cx="5486400" cy="2376170"/>
@@ -1157,22 +1107,138 @@
         </w:drawing>
       </w:r>
     </w:p>
+    <w:p>
+      <w:pPr>
+        <w:pStyle w:val="ListParagraph"/>
+        <w:numPr>
+          <w:ilvl w:val="0"/>
+          <w:numId w:val="10"/>
+        </w:numPr>
+      </w:pPr>
+      <w:r>
+        <w:t>The metric values fluctuate over time but show an overall upward trend. The error bars appear uniform across all timestamps (same height), indicating a constant standard deviation applied to every bar rather than time-specific variability. A risk, the same global standard deviation is used for every timestamp, the error bars may falsely suggest that variability is identical at all time points. This can mislead viewers into thinking uncertainty is constant over time, masking periods of higher or lower volatility.</w:t>
+      </w:r>
+      <w:r>
+        <w:t xml:space="preserve"> </w:t>
+      </w:r>
+    </w:p>
+    <w:p>
+      <w:r>
+        <w:drawing>
+          <wp:inline distT="0" distB="0" distL="0" distR="0" wp14:anchorId="69AD9FDE" wp14:editId="7EDB93FF">
+            <wp:extent cx="5486400" cy="3155950"/>
+            <wp:effectExtent l="0" t="0" r="0" b="6350"/>
+            <wp:docPr id="1622063824" name="Picture 1"/>
+            <wp:cNvGraphicFramePr>
+              <a:graphicFrameLocks xmlns:a="http://schemas.openxmlformats.org/drawingml/2006/main" noChangeAspect="1"/>
+            </wp:cNvGraphicFramePr>
+            <a:graphic xmlns:a="http://schemas.openxmlformats.org/drawingml/2006/main">
+              <a:graphicData uri="http://schemas.openxmlformats.org/drawingml/2006/picture">
+                <pic:pic xmlns:pic="http://schemas.openxmlformats.org/drawingml/2006/picture">
+                  <pic:nvPicPr>
+                    <pic:cNvPr id="1622063824" name=""/>
+                    <pic:cNvPicPr/>
+                  </pic:nvPicPr>
+                  <pic:blipFill>
+                    <a:blip r:embed="rId19"/>
+                    <a:stretch>
+                      <a:fillRect/>
+                    </a:stretch>
+                  </pic:blipFill>
+                  <pic:spPr>
+                    <a:xfrm>
+                      <a:off x="0" y="0"/>
+                      <a:ext cx="5486400" cy="3155950"/>
+                    </a:xfrm>
+                    <a:prstGeom prst="rect">
+                      <a:avLst/>
+                    </a:prstGeom>
+                  </pic:spPr>
+                </pic:pic>
+              </a:graphicData>
+            </a:graphic>
+          </wp:inline>
+        </w:drawing>
+      </w:r>
+    </w:p>
+    <w:p>
+      <w:pPr>
+        <w:pStyle w:val="ListParagraph"/>
+        <w:numPr>
+          <w:ilvl w:val="0"/>
+          <w:numId w:val="10"/>
+        </w:numPr>
+      </w:pPr>
+      <w:r>
+        <w:t>The plot reveals seasonal variation across sites, with Site A showing higher activity in several months. However, since this visualization displays record counts rather than aggregated metric values, differences may reflect unequal data frequency rather than true performance differences.</w:t>
+      </w:r>
+      <w:r>
+        <w:t xml:space="preserve"> </w:t>
+      </w:r>
+    </w:p>
     <w:p/>
     <w:p>
+      <w:r>
+        <w:drawing>
+          <wp:inline distT="0" distB="0" distL="0" distR="0" wp14:anchorId="4915085A" wp14:editId="57A81BED">
+            <wp:extent cx="5486400" cy="3250565"/>
+            <wp:effectExtent l="0" t="0" r="0" b="6985"/>
+            <wp:docPr id="503645611" name="Picture 1"/>
+            <wp:cNvGraphicFramePr>
+              <a:graphicFrameLocks xmlns:a="http://schemas.openxmlformats.org/drawingml/2006/main" noChangeAspect="1"/>
+            </wp:cNvGraphicFramePr>
+            <a:graphic xmlns:a="http://schemas.openxmlformats.org/drawingml/2006/main">
+              <a:graphicData uri="http://schemas.openxmlformats.org/drawingml/2006/picture">
+                <pic:pic xmlns:pic="http://schemas.openxmlformats.org/drawingml/2006/picture">
+                  <pic:nvPicPr>
+                    <pic:cNvPr id="503645611" name=""/>
+                    <pic:cNvPicPr/>
+                  </pic:nvPicPr>
+                  <pic:blipFill>
+                    <a:blip r:embed="rId20"/>
+                    <a:stretch>
+                      <a:fillRect/>
+                    </a:stretch>
+                  </pic:blipFill>
+                  <pic:spPr>
+                    <a:xfrm>
+                      <a:off x="0" y="0"/>
+                      <a:ext cx="5486400" cy="3250565"/>
+                    </a:xfrm>
+                    <a:prstGeom prst="rect">
+                      <a:avLst/>
+                    </a:prstGeom>
+                  </pic:spPr>
+                </pic:pic>
+              </a:graphicData>
+            </a:graphic>
+          </wp:inline>
+        </w:drawing>
+      </w:r>
+    </w:p>
+    <w:p>
+      <w:pPr>
+        <w:pStyle w:val="ListParagraph"/>
+        <w:numPr>
+          <w:ilvl w:val="0"/>
+          <w:numId w:val="10"/>
+        </w:numPr>
+      </w:pPr>
+      <w:r>
+        <w:t>Plot displays the monthly values of the metric value. December having the highest metric value. A risk this graph shows is there are two outliers for June and 1 outlier for May; showing infrequentcies with the data.</w:t>
+      </w:r>
+      <w:r>
+        <w:t xml:space="preserve"> </w:t>
+      </w:r>
+    </w:p>
+    <w:p/>
+    <w:p/>
+    <w:p>
       <w:pPr>
         <w:pStyle w:val="Heading3"/>
       </w:pPr>
       <w:r>
-        <w:lastRenderedPageBreak/>
-        <w:t xml:space="preserve">Q6 (10 </w:t>
-      </w:r>
-      <w:proofErr w:type="gramStart"/>
-      <w:r>
-        <w:t>pts) —</w:t>
-      </w:r>
-      <w:proofErr w:type="gramEnd"/>
-      <w:r>
-        <w:t xml:space="preserve"> Decision Ready Capstone (Pipeline: INTERPRETATION)</w:t>
+        <w:t>Q6 (10 pts) — Decision Ready Capstone (Pipeline: INTERPRETATION)</w:t>
       </w:r>
     </w:p>
     <w:p>
@@ -1242,12 +1308,12 @@
       </w:r>
     </w:p>
     <w:sectPr>
-      <w:headerReference w:type="even" r:id="rId19"/>
-      <w:headerReference w:type="default" r:id="rId20"/>
-      <w:footerReference w:type="even" r:id="rId21"/>
-      <w:footerReference w:type="default" r:id="rId22"/>
-      <w:headerReference w:type="first" r:id="rId23"/>
-      <w:footerReference w:type="first" r:id="rId24"/>
+      <w:headerReference w:type="even" r:id="rId21"/>
+      <w:headerReference w:type="default" r:id="rId22"/>
+      <w:footerReference w:type="even" r:id="rId23"/>
+      <w:footerReference w:type="default" r:id="rId24"/>
+      <w:headerReference w:type="first" r:id="rId25"/>
+      <w:footerReference w:type="first" r:id="rId26"/>
       <w:pgSz w:w="12240" w:h="15840"/>
       <w:pgMar w:top="1440" w:right="1800" w:bottom="1440" w:left="1800" w:header="720" w:footer="720" w:gutter="0"/>
       <w:cols w:space="720"/>
@@ -1522,7 +1588,7 @@
   <w:abstractNum w:abstractNumId="7" w15:restartNumberingAfterBreak="0">
     <w:nsid w:val="FFFFFF88"/>
     <w:multiLevelType w:val="singleLevel"/>
-    <w:tmpl w:val="D0A62B40"/>
+    <w:tmpl w:val="DFCE5BC0"/>
     <w:lvl w:ilvl="0">
       <w:start w:val="1"/>
       <w:numFmt w:val="decimal"/>
@@ -1699,6 +1765,9 @@
   </w:num>
   <w:num w:numId="10" w16cid:durableId="641037451">
     <w:abstractNumId w:val="9"/>
+  </w:num>
+  <w:num w:numId="11" w16cid:durableId="1903825983">
+    <w:abstractNumId w:val="7"/>
   </w:num>
 </w:numbering>
 </file>
@@ -2306,7 +2375,6 @@
   <w:style w:type="character" w:default="1" w:styleId="DefaultParagraphFont">
     <w:name w:val="Default Paragraph Font"/>
     <w:uiPriority w:val="1"/>
-    <w:semiHidden/>
     <w:unhideWhenUsed/>
   </w:style>
   <w:style w:type="table" w:default="1" w:styleId="TableNormal">

</xml_diff>

<commit_message>
meeting ready visualization and interpretation.
Signed-off-by: uofl-sbabb <sbabb131@gmail.com>
</commit_message>
<xml_diff>
--- a/Project2/Assignment2-02.docx
+++ b/Project2/Assignment2-02.docx
@@ -1124,6 +1124,9 @@
     </w:p>
     <w:p>
       <w:r>
+        <w:rPr>
+          <w:noProof/>
+        </w:rPr>
         <w:drawing>
           <wp:inline distT="0" distB="0" distL="0" distR="0" wp14:anchorId="69AD9FDE" wp14:editId="7EDB93FF">
             <wp:extent cx="5486400" cy="3155950"/>
@@ -1179,6 +1182,9 @@
     <w:p/>
     <w:p>
       <w:r>
+        <w:rPr>
+          <w:noProof/>
+        </w:rPr>
         <w:drawing>
           <wp:inline distT="0" distB="0" distL="0" distR="0" wp14:anchorId="4915085A" wp14:editId="57A81BED">
             <wp:extent cx="5486400" cy="3250565"/>
@@ -1225,7 +1231,19 @@
         </w:numPr>
       </w:pPr>
       <w:r>
-        <w:t>Plot displays the monthly values of the metric value. December having the highest metric value. A risk this graph shows is there are two outliers for June and 1 outlier for May; showing infrequentcies with the data.</w:t>
+        <w:t xml:space="preserve">Plot displays the monthly values of the metric value. December </w:t>
+      </w:r>
+      <w:r>
+        <w:t>has</w:t>
+      </w:r>
+      <w:r>
+        <w:t xml:space="preserve"> the highest metric value. A risk this graph shows is there are two outliers for June and 1 outlier for May; showing </w:t>
+      </w:r>
+      <w:r>
+        <w:t>infrequencies</w:t>
+      </w:r>
+      <w:r>
+        <w:t xml:space="preserve"> with the data.</w:t>
       </w:r>
       <w:r>
         <w:t xml:space="preserve"> </w:t>
@@ -1271,6 +1289,147 @@
       </w:r>
     </w:p>
     <w:p>
+      <w:pPr>
+        <w:pStyle w:val="ListBullet"/>
+        <w:numPr>
+          <w:ilvl w:val="0"/>
+          <w:numId w:val="0"/>
+        </w:numPr>
+        <w:ind w:left="360"/>
+      </w:pPr>
+    </w:p>
+    <w:p>
+      <w:pPr>
+        <w:pStyle w:val="ListBullet"/>
+        <w:numPr>
+          <w:ilvl w:val="0"/>
+          <w:numId w:val="10"/>
+        </w:numPr>
+      </w:pPr>
+      <w:r>
+        <w:t>What is the trend among each site and its metric_value?</w:t>
+      </w:r>
+    </w:p>
+    <w:p>
+      <w:pPr>
+        <w:pStyle w:val="ListBullet"/>
+        <w:numPr>
+          <w:ilvl w:val="0"/>
+          <w:numId w:val="10"/>
+        </w:numPr>
+      </w:pPr>
+      <w:r>
+        <w:t>Uncertainty: metric_value</w:t>
+      </w:r>
+    </w:p>
+    <w:p>
+      <w:pPr>
+        <w:pStyle w:val="ListBullet"/>
+        <w:numPr>
+          <w:ilvl w:val="0"/>
+          <w:numId w:val="10"/>
+        </w:numPr>
+      </w:pPr>
+      <w:r>
+        <w:t>Annotated event: ‘site’ and ‘timestamp’</w:t>
+      </w:r>
+    </w:p>
+    <w:p>
+      <w:pPr>
+        <w:pStyle w:val="ListBullet"/>
+        <w:numPr>
+          <w:ilvl w:val="0"/>
+          <w:numId w:val="0"/>
+        </w:numPr>
+        <w:ind w:left="360"/>
+      </w:pPr>
+      <w:r>
+        <w:lastRenderedPageBreak/>
+        <w:drawing>
+          <wp:inline distT="0" distB="0" distL="0" distR="0" wp14:anchorId="0D6E5478" wp14:editId="2F62F795">
+            <wp:extent cx="5486400" cy="3244850"/>
+            <wp:effectExtent l="0" t="0" r="0" b="0"/>
+            <wp:docPr id="1663000187" name="Picture 1"/>
+            <wp:cNvGraphicFramePr>
+              <a:graphicFrameLocks xmlns:a="http://schemas.openxmlformats.org/drawingml/2006/main" noChangeAspect="1"/>
+            </wp:cNvGraphicFramePr>
+            <a:graphic xmlns:a="http://schemas.openxmlformats.org/drawingml/2006/main">
+              <a:graphicData uri="http://schemas.openxmlformats.org/drawingml/2006/picture">
+                <pic:pic xmlns:pic="http://schemas.openxmlformats.org/drawingml/2006/picture">
+                  <pic:nvPicPr>
+                    <pic:cNvPr id="1663000187" name=""/>
+                    <pic:cNvPicPr/>
+                  </pic:nvPicPr>
+                  <pic:blipFill>
+                    <a:blip r:embed="rId21"/>
+                    <a:stretch>
+                      <a:fillRect/>
+                    </a:stretch>
+                  </pic:blipFill>
+                  <pic:spPr>
+                    <a:xfrm>
+                      <a:off x="0" y="0"/>
+                      <a:ext cx="5486400" cy="3244850"/>
+                    </a:xfrm>
+                    <a:prstGeom prst="rect">
+                      <a:avLst/>
+                    </a:prstGeom>
+                  </pic:spPr>
+                </pic:pic>
+              </a:graphicData>
+            </a:graphic>
+          </wp:inline>
+        </w:drawing>
+      </w:r>
+    </w:p>
+    <w:p>
+      <w:pPr>
+        <w:pStyle w:val="ListBullet"/>
+        <w:numPr>
+          <w:ilvl w:val="0"/>
+          <w:numId w:val="0"/>
+        </w:numPr>
+        <w:ind w:left="360"/>
+      </w:pPr>
+      <w:r>
+        <w:drawing>
+          <wp:inline distT="0" distB="0" distL="0" distR="0" wp14:anchorId="39A2A72F" wp14:editId="1C041F27">
+            <wp:extent cx="5486400" cy="713105"/>
+            <wp:effectExtent l="0" t="0" r="0" b="0"/>
+            <wp:docPr id="1423088894" name="Picture 1"/>
+            <wp:cNvGraphicFramePr>
+              <a:graphicFrameLocks xmlns:a="http://schemas.openxmlformats.org/drawingml/2006/main" noChangeAspect="1"/>
+            </wp:cNvGraphicFramePr>
+            <a:graphic xmlns:a="http://schemas.openxmlformats.org/drawingml/2006/main">
+              <a:graphicData uri="http://schemas.openxmlformats.org/drawingml/2006/picture">
+                <pic:pic xmlns:pic="http://schemas.openxmlformats.org/drawingml/2006/picture">
+                  <pic:nvPicPr>
+                    <pic:cNvPr id="1423088894" name=""/>
+                    <pic:cNvPicPr/>
+                  </pic:nvPicPr>
+                  <pic:blipFill>
+                    <a:blip r:embed="rId22"/>
+                    <a:stretch>
+                      <a:fillRect/>
+                    </a:stretch>
+                  </pic:blipFill>
+                  <pic:spPr>
+                    <a:xfrm>
+                      <a:off x="0" y="0"/>
+                      <a:ext cx="5486400" cy="713105"/>
+                    </a:xfrm>
+                    <a:prstGeom prst="rect">
+                      <a:avLst/>
+                    </a:prstGeom>
+                  </pic:spPr>
+                </pic:pic>
+              </a:graphicData>
+            </a:graphic>
+          </wp:inline>
+        </w:drawing>
+      </w:r>
+    </w:p>
+    <w:p>
       <w:r>
         <w:t>Write (150–250 words):</w:t>
       </w:r>
@@ -1307,13 +1466,78 @@
         <w:t>What risk or uncertainty remains?</w:t>
       </w:r>
     </w:p>
+    <w:p>
+      <w:pPr>
+        <w:pStyle w:val="ListBullet"/>
+        <w:numPr>
+          <w:ilvl w:val="0"/>
+          <w:numId w:val="0"/>
+        </w:numPr>
+        <w:ind w:left="360"/>
+      </w:pPr>
+    </w:p>
+    <w:p>
+      <w:pPr>
+        <w:pStyle w:val="ListBullet"/>
+        <w:numPr>
+          <w:ilvl w:val="0"/>
+          <w:numId w:val="10"/>
+        </w:numPr>
+        <w:spacing w:line="360" w:lineRule="auto"/>
+      </w:pPr>
+      <w:r>
+        <w:t>Based off the visual you can see that site C metric_value increases as the two sites decrease (Negative Correlation). When site C decreases the two sites increase (Negative Correlation). For January and December, site C saw some increases in metric_value. Also, between April and May there were increases for site C. In June site C decreased at its lowest point, while the other two sites saw an increase. A risk this data has is the display of Negative Correlation with site C compared to the other two sites.</w:t>
+      </w:r>
+      <w:r>
+        <w:t xml:space="preserve"> </w:t>
+      </w:r>
+      <w:r>
+        <w:t>The evidence supporting this comes from the line trajectories. All three sites fall from roughly the mid-60s in January to the low- to mid-50s by March/April. Site C shows the greatest volatility, with a sharp spike in February (around the high 70s) and a pronounced drop in June (mid-50s).</w:t>
+      </w:r>
+      <w:r>
+        <w:t xml:space="preserve"> </w:t>
+      </w:r>
+      <w:r>
+        <w:t xml:space="preserve">A potential decision would be to allocate additional resources or implement corrective strategies in Q1, when </w:t>
+      </w:r>
+      <w:r>
+        <w:lastRenderedPageBreak/>
+        <w:t>performance tends to dip. Conversely, leadership could prepare to capitalize on higher performance in Q4, possibly scaling campaigns or production during that period.</w:t>
+      </w:r>
+      <w:r>
+        <w:t xml:space="preserve"> </w:t>
+      </w:r>
+      <w:r>
+        <w:t>However, uncertainty remains due to variability indicated by the confidence bands and the limited time horizon (one year). External factors driving seasonality are not shown, so the pattern may not repeat consistently in future years.</w:t>
+      </w:r>
+    </w:p>
+    <w:p>
+      <w:pPr>
+        <w:pStyle w:val="ListBullet"/>
+        <w:numPr>
+          <w:ilvl w:val="0"/>
+          <w:numId w:val="0"/>
+        </w:numPr>
+        <w:ind w:left="360"/>
+      </w:pPr>
+    </w:p>
+    <w:p>
+      <w:pPr>
+        <w:pStyle w:val="ListBullet"/>
+        <w:numPr>
+          <w:ilvl w:val="0"/>
+          <w:numId w:val="0"/>
+        </w:numPr>
+        <w:ind w:left="360"/>
+      </w:pPr>
+    </w:p>
     <w:sectPr>
-      <w:headerReference w:type="even" r:id="rId21"/>
-      <w:headerReference w:type="default" r:id="rId22"/>
-      <w:footerReference w:type="even" r:id="rId23"/>
-      <w:footerReference w:type="default" r:id="rId24"/>
-      <w:headerReference w:type="first" r:id="rId25"/>
-      <w:footerReference w:type="first" r:id="rId26"/>
+      <w:headerReference w:type="even" r:id="rId23"/>
+      <w:headerReference w:type="default" r:id="rId24"/>
+      <w:footerReference w:type="even" r:id="rId25"/>
+      <w:footerReference w:type="default" r:id="rId26"/>
+      <w:headerReference w:type="first" r:id="rId27"/>
+      <w:footerReference w:type="first" r:id="rId28"/>
       <w:pgSz w:w="12240" w:h="15840"/>
       <w:pgMar w:top="1440" w:right="1800" w:bottom="1440" w:left="1800" w:header="720" w:footer="720" w:gutter="0"/>
       <w:cols w:space="720"/>
@@ -1606,7 +1830,7 @@
   <w:abstractNum w:abstractNumId="8" w15:restartNumberingAfterBreak="0">
     <w:nsid w:val="FFFFFF89"/>
     <w:multiLevelType w:val="singleLevel"/>
-    <w:tmpl w:val="29761A62"/>
+    <w:tmpl w:val="7CAEB184"/>
     <w:lvl w:ilvl="0">
       <w:start w:val="1"/>
       <w:numFmt w:val="bullet"/>
@@ -13151,6 +13375,19 @@
       </w:tcPr>
     </w:tblStylePr>
   </w:style>
+  <w:style w:type="paragraph" w:styleId="NormalWeb">
+    <w:name w:val="Normal (Web)"/>
+    <w:basedOn w:val="Normal"/>
+    <w:uiPriority w:val="99"/>
+    <w:semiHidden/>
+    <w:unhideWhenUsed/>
+    <w:rsid w:val="00A511CE"/>
+    <w:rPr>
+      <w:rFonts w:ascii="Times New Roman" w:hAnsi="Times New Roman" w:cs="Times New Roman"/>
+      <w:sz w:val="24"/>
+      <w:szCs w:val="24"/>
+    </w:rPr>
+  </w:style>
 </w:styles>
 </file>
 

</xml_diff>

<commit_message>
updated interpretation on data.
Signed-off-by: uofl-sbabb <sbabb131@gmail.com>
</commit_message>
<xml_diff>
--- a/Project2/Assignment2-02.docx
+++ b/Project2/Assignment2-02.docx
@@ -61,8 +61,13 @@
       <w:pPr>
         <w:pStyle w:val="ListBullet"/>
       </w:pPr>
-      <w:r>
-        <w:t>metric_value: numeric measurement (messy on purpose: missing values, extreme outliers)</w:t>
+      <w:proofErr w:type="spellStart"/>
+      <w:r>
+        <w:t>metric_value</w:t>
+      </w:r>
+      <w:proofErr w:type="spellEnd"/>
+      <w:r>
+        <w:t>: numeric measurement (messy on purpose: missing values, extreme outliers)</w:t>
       </w:r>
     </w:p>
     <w:p>
@@ -85,16 +90,42 @@
       <w:pPr>
         <w:pStyle w:val="ListBullet"/>
       </w:pPr>
-      <w:r>
-        <w:t>extra_column_int: represents numeric values generated by internal systems. In real organizations, similar columns often appear.</w:t>
+      <w:proofErr w:type="spellStart"/>
+      <w:r>
+        <w:t>extra_column_int</w:t>
+      </w:r>
+      <w:proofErr w:type="spellEnd"/>
+      <w:r>
+        <w:t>: represents numeric values generated by internal systems. In real organizations, similar columns often appear.</w:t>
       </w:r>
     </w:p>
     <w:p>
       <w:pPr>
         <w:pStyle w:val="ListBullet"/>
       </w:pPr>
-      <w:r>
-        <w:t>extra_column_flag: simulates boolean flags commonly added during data processing pipelines.</w:t>
+      <w:proofErr w:type="spellStart"/>
+      <w:r>
+        <w:t>extra_column_</w:t>
+      </w:r>
+      <w:proofErr w:type="gramStart"/>
+      <w:r>
+        <w:t>flag</w:t>
+      </w:r>
+      <w:proofErr w:type="spellEnd"/>
+      <w:r>
+        <w:t>:</w:t>
+      </w:r>
+      <w:proofErr w:type="gramEnd"/>
+      <w:r>
+        <w:t xml:space="preserve"> simulates </w:t>
+      </w:r>
+      <w:proofErr w:type="spellStart"/>
+      <w:r>
+        <w:t>boolean</w:t>
+      </w:r>
+      <w:proofErr w:type="spellEnd"/>
+      <w:r>
+        <w:t xml:space="preserve"> flags commonly added during data processing pipelines.</w:t>
       </w:r>
     </w:p>
     <w:p>
@@ -126,7 +157,15 @@
         <w:pStyle w:val="ListBullet"/>
       </w:pPr>
       <w:r>
-        <w:t>Timestamps may not parse cleanly</w:t>
+        <w:t xml:space="preserve">Timestamps may not </w:t>
+      </w:r>
+      <w:proofErr w:type="gramStart"/>
+      <w:r>
+        <w:t>parse</w:t>
+      </w:r>
+      <w:proofErr w:type="gramEnd"/>
+      <w:r>
+        <w:t xml:space="preserve"> cleanly</w:t>
       </w:r>
     </w:p>
     <w:p>
@@ -158,7 +197,15 @@
         <w:pStyle w:val="Heading3"/>
       </w:pPr>
       <w:r>
-        <w:t>Q1 (5 pts) — Data Audit (Pipeline: DATA)</w:t>
+        <w:t xml:space="preserve">Q1 (5 </w:t>
+      </w:r>
+      <w:proofErr w:type="gramStart"/>
+      <w:r>
+        <w:t>pts) —</w:t>
+      </w:r>
+      <w:proofErr w:type="gramEnd"/>
+      <w:r>
+        <w:t xml:space="preserve"> Data Audit (Pipeline: DATA)</w:t>
       </w:r>
     </w:p>
     <w:p>
@@ -277,7 +324,23 @@
         </w:numPr>
       </w:pPr>
       <w:r>
-        <w:t>Fix the missing values with ‘timestamp’ and ‘metric_value’. Solution: remove missing values for ‘timestamp’ and replace missing values with avg. for ‘metric_value’.</w:t>
+        <w:t>Fix the missing values with ‘timestamp’ and ‘</w:t>
+      </w:r>
+      <w:proofErr w:type="spellStart"/>
+      <w:r>
+        <w:t>metric_value</w:t>
+      </w:r>
+      <w:proofErr w:type="spellEnd"/>
+      <w:r>
+        <w:t>’. Solution: remove missing values for ‘timestamp’ and replace missing values with avg. for ‘</w:t>
+      </w:r>
+      <w:proofErr w:type="spellStart"/>
+      <w:r>
+        <w:t>metric_value</w:t>
+      </w:r>
+      <w:proofErr w:type="spellEnd"/>
+      <w:r>
+        <w:t>’.</w:t>
       </w:r>
     </w:p>
     <w:p>
@@ -289,7 +352,15 @@
         </w:numPr>
       </w:pPr>
       <w:r>
-        <w:t>Fix outlier with ‘metric_value’ being the min. in the negatives. Solution: replace negative value with 0.</w:t>
+        <w:t>Fix outlier with ‘</w:t>
+      </w:r>
+      <w:proofErr w:type="spellStart"/>
+      <w:r>
+        <w:t>metric_value</w:t>
+      </w:r>
+      <w:proofErr w:type="spellEnd"/>
+      <w:r>
+        <w:t>’ being the min. in the negatives. Solution: replace negative value with 0.</w:t>
       </w:r>
     </w:p>
     <w:p>
@@ -306,7 +377,15 @@
         <w:pStyle w:val="Heading3"/>
       </w:pPr>
       <w:r>
-        <w:t>Q2 (15 pts) — Timestamp Cleaning (Pipeline: TRANSFORM)</w:t>
+        <w:t xml:space="preserve">Q2 (15 </w:t>
+      </w:r>
+      <w:proofErr w:type="gramStart"/>
+      <w:r>
+        <w:t>pts) —</w:t>
+      </w:r>
+      <w:proofErr w:type="gramEnd"/>
+      <w:r>
+        <w:t xml:space="preserve"> Timestamp Cleaning (Pipeline: TRANSFORM)</w:t>
       </w:r>
     </w:p>
     <w:p>
@@ -409,7 +488,23 @@
         </w:numPr>
       </w:pPr>
       <w:r>
-        <w:t>Dropped the row with na value from ‘tiimestamp’:</w:t>
+        <w:t xml:space="preserve">Dropped the row with </w:t>
+      </w:r>
+      <w:proofErr w:type="spellStart"/>
+      <w:r>
+        <w:t>na</w:t>
+      </w:r>
+      <w:proofErr w:type="spellEnd"/>
+      <w:r>
+        <w:t xml:space="preserve"> value from ‘</w:t>
+      </w:r>
+      <w:proofErr w:type="spellStart"/>
+      <w:r>
+        <w:t>tiimestamp</w:t>
+      </w:r>
+      <w:proofErr w:type="spellEnd"/>
+      <w:r>
+        <w:t>’:</w:t>
       </w:r>
     </w:p>
     <w:p>
@@ -569,7 +664,15 @@
         </w:numPr>
       </w:pPr>
       <w:r>
-        <w:t>Replace missing ‘metric_value’ with avg. value:</w:t>
+        <w:t>Replace missing ‘</w:t>
+      </w:r>
+      <w:proofErr w:type="spellStart"/>
+      <w:r>
+        <w:t>metric_value</w:t>
+      </w:r>
+      <w:proofErr w:type="spellEnd"/>
+      <w:r>
+        <w:t>’ with avg. value:</w:t>
       </w:r>
     </w:p>
     <w:p>
@@ -685,7 +788,15 @@
         <w:pStyle w:val="Heading3"/>
       </w:pPr>
       <w:r>
-        <w:t>Q3 (5 pts) — Missing Values Strategy (Pipeline: TRANSFORM)</w:t>
+        <w:t xml:space="preserve">Q3 (5 </w:t>
+      </w:r>
+      <w:proofErr w:type="gramStart"/>
+      <w:r>
+        <w:t>pts) —</w:t>
+      </w:r>
+      <w:proofErr w:type="gramEnd"/>
+      <w:r>
+        <w:t xml:space="preserve"> Missing Values Strategy (Pipeline: TRANSFORM)</w:t>
       </w:r>
     </w:p>
     <w:p>
@@ -739,7 +850,15 @@
         </w:numPr>
       </w:pPr>
       <w:r>
-        <w:t>I chose to fill ‘metric_value’ with avg. metric value instead of dropping or forward/backward fill. Bias this method could introduce is having more average values being expressed in the dataset/data visualization process.</w:t>
+        <w:t>I chose to fill ‘</w:t>
+      </w:r>
+      <w:proofErr w:type="spellStart"/>
+      <w:r>
+        <w:t>metric_value</w:t>
+      </w:r>
+      <w:proofErr w:type="spellEnd"/>
+      <w:r>
+        <w:t>’ with avg. metric value instead of dropping or forward/backward fill. Bias this method could introduce is having more average values being expressed in the dataset/data visualization process.</w:t>
       </w:r>
     </w:p>
     <w:p>
@@ -747,7 +866,15 @@
         <w:pStyle w:val="Heading3"/>
       </w:pPr>
       <w:r>
-        <w:t>Q4 (5 pts) — Outliers Strategy (Pipeline: TRANSFORM)</w:t>
+        <w:t xml:space="preserve">Q4 (5 </w:t>
+      </w:r>
+      <w:proofErr w:type="gramStart"/>
+      <w:r>
+        <w:t>pts) —</w:t>
+      </w:r>
+      <w:proofErr w:type="gramEnd"/>
+      <w:r>
+        <w:t xml:space="preserve"> Outliers Strategy (Pipeline: TRANSFORM)</w:t>
       </w:r>
     </w:p>
     <w:p>
@@ -768,7 +895,15 @@
         <w:pStyle w:val="ListBullet"/>
       </w:pPr>
       <w:r>
-        <w:t>Cap them (winsorize)</w:t>
+        <w:t>Cap them (</w:t>
+      </w:r>
+      <w:proofErr w:type="spellStart"/>
+      <w:r>
+        <w:t>winsorize</w:t>
+      </w:r>
+      <w:proofErr w:type="spellEnd"/>
+      <w:r>
+        <w:t>)</w:t>
       </w:r>
     </w:p>
     <w:p>
@@ -793,7 +928,23 @@
         </w:numPr>
       </w:pPr>
       <w:r>
-        <w:t>There were over 19 outliers flagged for the meters_value column. I decided to remove the outliers. This resulted in the zscore value being closer to the 0 range, meaning the average value is more expressed.</w:t>
+        <w:t xml:space="preserve">There were over 19 outliers flagged for the </w:t>
+      </w:r>
+      <w:proofErr w:type="spellStart"/>
+      <w:r>
+        <w:t>meters_value</w:t>
+      </w:r>
+      <w:proofErr w:type="spellEnd"/>
+      <w:r>
+        <w:t xml:space="preserve"> column. I decided to remove the outliers. This resulted in the </w:t>
+      </w:r>
+      <w:proofErr w:type="spellStart"/>
+      <w:r>
+        <w:t>zscore</w:t>
+      </w:r>
+      <w:proofErr w:type="spellEnd"/>
+      <w:r>
+        <w:t xml:space="preserve"> value being closer to the 0 range, meaning the average value is more expressed.</w:t>
       </w:r>
     </w:p>
     <w:p>
@@ -898,7 +1049,15 @@
         <w:pStyle w:val="Heading3"/>
       </w:pPr>
       <w:r>
-        <w:t>Q5 (10 pts) — Visualization Set (Pipeline: ENCODING + PERCEPTION)</w:t>
+        <w:t xml:space="preserve">Q5 (10 </w:t>
+      </w:r>
+      <w:proofErr w:type="gramStart"/>
+      <w:r>
+        <w:t>pts) —</w:t>
+      </w:r>
+      <w:proofErr w:type="gramEnd"/>
+      <w:r>
+        <w:t xml:space="preserve"> Visualization Set (Pipeline: ENCODING + PERCEPTION)</w:t>
       </w:r>
     </w:p>
     <w:p>
@@ -1006,10 +1165,34 @@
         </w:numPr>
       </w:pPr>
       <w:r>
-        <w:t>Time series plot showing trend among the metric_value. You can see that the metric_value often increases and decreases. Yearly increases.</w:t>
-      </w:r>
-      <w:r>
-        <w:t xml:space="preserve"> A risk this graph shows is high volatility and uncertainty with the infrequencies with the metric_value.</w:t>
+        <w:t xml:space="preserve">Time series plot showing trend among the </w:t>
+      </w:r>
+      <w:proofErr w:type="spellStart"/>
+      <w:r>
+        <w:t>metric_value</w:t>
+      </w:r>
+      <w:proofErr w:type="spellEnd"/>
+      <w:r>
+        <w:t xml:space="preserve">. You can see that the </w:t>
+      </w:r>
+      <w:proofErr w:type="spellStart"/>
+      <w:r>
+        <w:t>metric_value</w:t>
+      </w:r>
+      <w:proofErr w:type="spellEnd"/>
+      <w:r>
+        <w:t xml:space="preserve"> often increases and decreases. Yearly increases.</w:t>
+      </w:r>
+      <w:r>
+        <w:t xml:space="preserve"> A risk this graph shows is high volatility and uncertainty with the infrequencies with the </w:t>
+      </w:r>
+      <w:proofErr w:type="spellStart"/>
+      <w:r>
+        <w:t>metric_value</w:t>
+      </w:r>
+      <w:proofErr w:type="spellEnd"/>
+      <w:r>
+        <w:t>.</w:t>
       </w:r>
     </w:p>
     <w:p>
@@ -1063,7 +1246,15 @@
         </w:numPr>
       </w:pPr>
       <w:r>
-        <w:t>Two time series plots show the increase and decrease of the two numerical values. You can see that the metric value increases each year. A risk with this data plot is the upward movement could be mistaken for sustained long-term growth when it may partly reflect seasonality or external factors, not a structural increase. Another risk for the second plot, The random spikes could be misread as meaningful patterns or trends, when they may simply reflect noise or short-term fluctuations rather than systematic change.</w:t>
+        <w:t xml:space="preserve">Two time series plots show the increase and decrease of the two numerical values. You can see that the metric value increases each year. A risk with this data plot is the upward movement could be mistaken for sustained long-term growth when it may partly reflect seasonality or external factors, not a structural increase. Another risk for the second plot, </w:t>
+      </w:r>
+      <w:proofErr w:type="gramStart"/>
+      <w:r>
+        <w:t>The</w:t>
+      </w:r>
+      <w:proofErr w:type="gramEnd"/>
+      <w:r>
+        <w:t xml:space="preserve"> random spikes could be misread as meaningful patterns or trends, when they may simply reflect noise or short-term fluctuations rather than systematic change.</w:t>
       </w:r>
       <w:r>
         <w:t xml:space="preserve"> </w:t>
@@ -1242,7 +1433,15 @@
         <w:t>has</w:t>
       </w:r>
       <w:r>
-        <w:t xml:space="preserve"> the highest metric value. A risk this graph shows is there are two outliers for June and 1 outlier for May; showing </w:t>
+        <w:t xml:space="preserve"> the highest metric value. A risk this graph shows is there are two outliers for June and 1 outlier for </w:t>
+      </w:r>
+      <w:proofErr w:type="gramStart"/>
+      <w:r>
+        <w:t>May;</w:t>
+      </w:r>
+      <w:proofErr w:type="gramEnd"/>
+      <w:r>
+        <w:t xml:space="preserve"> showing </w:t>
       </w:r>
       <w:r>
         <w:t>infrequencies</w:t>
@@ -1261,7 +1460,15 @@
         <w:pStyle w:val="Heading3"/>
       </w:pPr>
       <w:r>
-        <w:t>Q6 (10 pts) — Decision Ready Capstone (Pipeline: INTERPRETATION)</w:t>
+        <w:t xml:space="preserve">Q6 (10 </w:t>
+      </w:r>
+      <w:proofErr w:type="gramStart"/>
+      <w:r>
+        <w:t>pts) —</w:t>
+      </w:r>
+      <w:proofErr w:type="gramEnd"/>
+      <w:r>
+        <w:t xml:space="preserve"> Decision Ready Capstone (Pipeline: INTERPRETATION)</w:t>
       </w:r>
     </w:p>
     <w:p>
@@ -1312,7 +1519,15 @@
         </w:numPr>
       </w:pPr>
       <w:r>
-        <w:t>What is the trend among each site and its metric_value?</w:t>
+        <w:t xml:space="preserve">What is the trend among each site and its </w:t>
+      </w:r>
+      <w:proofErr w:type="spellStart"/>
+      <w:r>
+        <w:t>metric_value</w:t>
+      </w:r>
+      <w:proofErr w:type="spellEnd"/>
+      <w:r>
+        <w:t>?</w:t>
       </w:r>
     </w:p>
     <w:p>
@@ -1324,8 +1539,13 @@
         </w:numPr>
       </w:pPr>
       <w:r>
-        <w:t>Uncertainty: metric_value</w:t>
-      </w:r>
+        <w:t xml:space="preserve">Uncertainty: </w:t>
+      </w:r>
+      <w:proofErr w:type="spellStart"/>
+      <w:r>
+        <w:t>metric_value</w:t>
+      </w:r>
+      <w:proofErr w:type="spellEnd"/>
     </w:p>
     <w:p>
       <w:pPr>
@@ -1497,7 +1717,31 @@
         <w:spacing w:line="360" w:lineRule="auto"/>
       </w:pPr>
       <w:r>
-        <w:t>Based off the visual you can see that site C metric_value increases as the two sites decrease (Negative Correlation). When site C decreases the two sites increase (Negative Correlation). For January and December, site C saw some increases in metric_value. Also, between April and May there were increases for site C. In June site C decreased at its lowest point, while the other two sites saw an increase. A risk this data has is the display of Negative Correlation with site C compared to the other two sites.</w:t>
+        <w:t xml:space="preserve">Based off the visual you can see that site C </w:t>
+      </w:r>
+      <w:proofErr w:type="spellStart"/>
+      <w:r>
+        <w:t>metric_value</w:t>
+      </w:r>
+      <w:proofErr w:type="spellEnd"/>
+      <w:r>
+        <w:t xml:space="preserve"> increases as the two sites decrease (Negative Correlation). When site C decreases the two sites increase (Negative Correlation). For January and December, site C saw some increases in </w:t>
+      </w:r>
+      <w:proofErr w:type="spellStart"/>
+      <w:r>
+        <w:t>metric_value</w:t>
+      </w:r>
+      <w:proofErr w:type="spellEnd"/>
+      <w:r>
+        <w:t xml:space="preserve">. Also, between April and May there were increases for site C. In June site C decreased </w:t>
+      </w:r>
+      <w:proofErr w:type="gramStart"/>
+      <w:r>
+        <w:t>at</w:t>
+      </w:r>
+      <w:proofErr w:type="gramEnd"/>
+      <w:r>
+        <w:t xml:space="preserve"> its lowest point, while the other two sites saw an increase. A risk this data has is the display of Negative Correlation with site C compared to the other two sites.</w:t>
       </w:r>
       <w:r>
         <w:t xml:space="preserve"> </w:t>
@@ -1519,7 +1763,15 @@
         <w:t xml:space="preserve"> </w:t>
       </w:r>
       <w:r>
-        <w:t>However, uncertainty remains due to variability indicated by the confidence bands and the limited time horizon (one year). External factors driving seasonality are not shown, so the pattern may not repeat consistently in future years.</w:t>
+        <w:t xml:space="preserve">However, uncertainty remains due to variability indicated by the confidence bands and the limited time horizon (one year). External </w:t>
+      </w:r>
+      <w:proofErr w:type="gramStart"/>
+      <w:r>
+        <w:t>factors</w:t>
+      </w:r>
+      <w:proofErr w:type="gramEnd"/>
+      <w:r>
+        <w:t xml:space="preserve"> driving seasonality are not shown, so the pattern may not repeat consistently in future years.</w:t>
       </w:r>
     </w:p>
     <w:p>

</xml_diff>